<commit_message>
docs: record experiment 5 commit hash in the report
</commit_message>
<xml_diff>
--- a/软工2班-24111302097-蔡春阳-实验5-LLM、Context与RAG实现.docx
+++ b/软工2班-24111302097-蔡春阳-实验5-LLM、Context与RAG实现.docx
@@ -17305,7 +17305,25 @@
           <w:sz w:val="19"/>
           <w:szCs w:val="19"/>
         </w:rPr>
-        <w:t xml:space="preserve">本次提交内容：rag/（知识库、模块、测试、运行记录）、scripts/exp5/（绘图脚本）、素材/E5-*.png、本报告（.md/.docx/.pdf）。</w:t>
+        <w:t xml:space="preserve">本次提交：49dd1d3（feat: implement experiment 5 LLM/context/RAG chain with knowledge base, hybrid retrieval and two-group comparison），已推送到 main。</w:t>
+      </w:r>
+    </w:p>
+    <w:p>
+      <w:pPr>
+        <w:pStyle w:val="ListParagraph"/>
+        <w:numPr>
+          <w:ilvl w:val="0"/>
+          <w:numId w:val="1"/>
+        </w:numPr>
+        <w:spacing w:after="65" w:line="275"/>
+      </w:pPr>
+      <w:r>
+        <w:rPr>
+          <w:rFonts w:ascii="Microsoft YaHei" w:cs="Microsoft YaHei" w:eastAsia="Microsoft YaHei" w:hAnsi="Microsoft YaHei"/>
+          <w:sz w:val="19"/>
+          <w:szCs w:val="19"/>
+        </w:rPr>
+        <w:t xml:space="preserve">提交内容：rag/（知识库、模块、测试、运行记录，共 79 个文件）、scripts/exp5/（绘图脚本）、scripts/build-report5-*.mjs（报告构建）、素材/E5-*.png、本报告（.md/.docx/.pdf）。</w:t>
       </w:r>
     </w:p>
     <w:p>

</xml_diff>